<commit_message>
R9: separate event and linguistic levels in Introduction; rating block order counterbalanced
Co-Authored-By: Claude Opus 5.5 <noreply@anthropic.com>
Claude-Session: https://claude.ai/code/session_01Q96WePso3R7jviE8KBARip
</commit_message>
<xml_diff>
--- a/drafts/Manuscript_R9_APA.docx
+++ b/drafts/Manuscript_R9_APA.docx
@@ -611,7 +611,7 @@
       <w:pPr/>
       <w:r>
         <w:rPr/>
-        <w:t>Can Mandarin-speaking children distinguish RVCs from their V1s in this respect? Children produce RVCs early, although their command of RVC event structure develops gradually (Chen, 2008; Deng, 2019), and by around 5 years of age they treat RVCs as requiring the result in comprehension (J. Liu et al., 2026). Their interpretation of the corresponding V1s, however, is less adult-like: Children have difficulty unpacking the meanings of the individual verbs in RVCs (Chen, 2017) and judge V1 descriptions of events without the result more strictly than adults do (J. Liu et al., 2026). This pattern raises the question of how children interpret monomorphemic V1s, and it cannot be answered by contrasting V1s with RVCs alone, because adults’ result-related interpretations also vary across monomorphemic verbs (Chen, 2018). Whether a child accepts a V1 description of an unattained result may therefore depend on which V1 is used and on how that action is related to the result in question.</w:t>
+        <w:t>Can Mandarin-speaking children distinguish RVCs from their V1s in this respect? Children produce RVCs early, although their command of RVC event structure develops gradually (Chen, 2008; Deng, 2019), and by around 5 years of age they treat RVCs as requiring the result in comprehension (J. Liu et al., 2026). Their interpretation of the corresponding V1s, however, is less adult-like: Children have difficulty unpacking the meanings of the individual verbs in RVCs (Chen, 2017) and judge V1 descriptions of events without the result more strictly than adults do (J. Liu et al., 2026). This pattern raises the question of how children interpret monomorphemic V1s, and it cannot be answered by contrasting V1s with RVCs alone, because adults’ result-related interpretations also vary across monomorphemic verbs (Chen, 2018). Whether a child accepts a V1 description of an unattained result may therefore depend on which V1 is used and on how the action it names is related to the result in question.</w:t>
       </w:r>
     </w:p>
     <w:p>
@@ -623,7 +623,7 @@
       </w:r>
       <w:r>
         <w:rPr/>
-        <w:t>and it compares pairs of V1s that take the same object and share a target result but were selected to differ in how strongly the actions they denote are associated with that result</w:t>
+        <w:t>and it compares pairs of V1s that take the same object and combine with the same V2 but were selected to differ in how strongly the actions they denote are associated with that result</w:t>
       </w:r>
       <w:r>
         <w:rPr/>
@@ -792,7 +792,7 @@
       <w:proofErr w:type="spellEnd"/>
       <w:r>
         <w:rPr/>
-        <w:t xml:space="preserve"> “beat.” These combinations are not equally conventional, however, and existing accounts do not specify what makes a given V1 a </w:t>
+        <w:t xml:space="preserve"> “beat.” These combinations are not equally conventional, however, and existing accounts do not specify what makes the action named by a given V1 a </w:t>
       </w:r>
       <w:proofErr w:type="gramStart"/>
       <w:r>
@@ -929,7 +929,7 @@
       <w:pPr/>
       <w:r>
         <w:rPr/>
-        <w:t xml:space="preserve">This verb-level characterization is a limitation for studying how a V1 description is interpreted for a particular event. A comprehension task presents a V1 with a particular object and asks about a particular result, and, as the combination facts show, a V1’s relation to a result depends on the result in question: Kicking is plausibly a reliable way of knocking over a bottle but a less reliable way of opening a door. Work on sentence processing likewise shows that </w:t>
+        <w:t xml:space="preserve">This verb-level characterization is a limitation for studying how a V1 description is interpreted for a particular event. A comprehension task presents a V1 with a particular object and asks about a particular result, and, as the combination facts show, the relation between the action named by a V1 and a result depends on the result in question: Kicking is plausibly a reliable way of knocking over a bottle but a less reliable way of opening a door. Work on sentence processing likewise shows that </w:t>
       </w:r>
       <w:proofErr w:type="spellStart"/>
       <w:r>
@@ -939,14 +939,14 @@
       <w:proofErr w:type="spellEnd"/>
       <w:r>
         <w:rPr/>
-        <w:t>’ expectations about events depend on the combination of a verb with its arguments rather than on the verb alone (Bicknell et al., 2010; McRae &amp; Matsuki, 2009). Previous child studies have described differences among V1s in terms of the strength of the result inference without measuring the particular action–result relation depicted. The present study does not propose a new classification of V1s. Instead, it characterizes the selected V1–object expressions by their association with a specified target result.</w:t>
+        <w:t>’ expectations about events depend on the combination of a verb with its arguments rather than on the verb alone (Bicknell et al., 2010; McRae &amp; Matsuki, 2009). Previous child studies have described differences among V1s in terms of the strength of the result inference without measuring the particular action–result relation depicted. The present study does not propose a new classification of V1s. Instead, it characterizes the actions named by the selected V1–object expressions by their association with a specified target result.</w:t>
       </w:r>
     </w:p>
     <w:p>
       <w:pPr/>
       <w:r>
         <w:rPr/>
-        <w:t xml:space="preserve">The relation between a V1 action and a target result, which we refer to as </w:t>
+        <w:t xml:space="preserve">The relation between the action named by a V1 and a target result, which we refer to as </w:t>
       </w:r>
       <w:r>
         <w:rPr>
@@ -957,7 +957,7 @@
       </w:r>
       <w:r>
         <w:rPr/>
-        <w:t>, can be evaluated from either end. Result likelihood starts from the action: Once the V1–object action has been performed, how likely is the target result to follow? Action typicality starts from the result: Given the target result, how typical is the action as a means of achieving it? Blowing on a candle, for example, is both likely to put it out and a typical way of doing so, whereas waving at it is neither. Both dimensions concern the relation on which RVC formation depends, namely how a particular V1 event relates to a particular result, and both bear on which stage of an event a V1 description is taken to describe.</w:t>
+        <w:t>, can be evaluated from either end. Result likelihood starts from the action: Once the action named by the V1–object expression has been performed, how likely is the target result to follow? Action typicality starts from the result: Given the target result, how typical is the action as a means of achieving it? Blowing on a candle, for example, is both likely to put it out and a typical way of doing so, whereas waving at it is neither. Both dimensions concern the relation on which RVC formation depends, namely how a particular action relates to a particular result, and both bear on which stage of an event a V1 description is taken to describe.</w:t>
       </w:r>
     </w:p>
     <w:p>
@@ -1003,7 +1003,7 @@
       <w:pPr/>
       <w:r>
         <w:rPr/>
-        <w:t xml:space="preserve">The two dimensions are expected to go together, because an action that reliably produces a result is often also a common way of producing it, although they need not coincide in every case (Kim &amp; Murphy, 2011). The present study uses them jointly: A V1–object expression has a stronger association with the target result than its partner when adults rate the result as more likely to follow the action and the action as a more typical means of achieving it. </w:t>
+        <w:t xml:space="preserve">The two dimensions are expected to go together, because an action that reliably produces a result is often also a common way of producing it, although they need not coincide in every case (Kim &amp; Murphy, 2011). The present study uses them jointly: The action named by a V1–object expression has a stronger association with the target result than the action named by its partner when adults rate the result as more likely to follow the action and the action as a more typical means of achieving it. </w:t>
       </w:r>
       <w:r>
         <w:rPr/>
@@ -1030,7 +1030,7 @@
       <w:proofErr w:type="gramEnd"/>
       <w:r>
         <w:rPr/>
-        <w:t xml:space="preserve"> children’s own knowledge; both are adult reference measures of the selected V1–object–result relations.</w:t>
+        <w:t xml:space="preserve"> children’s own knowledge; both are adult reference measures of the relations between the selected actions and their target results.</w:t>
       </w:r>
     </w:p>
     <w:p>
@@ -1142,7 +1142,7 @@
       <w:proofErr w:type="spellEnd"/>
       <w:r>
         <w:rPr/>
-        <w:t xml:space="preserve"> “several times,” and found that children, unlike adults, were not influenced by whether the agent was in control of the event. Chen (2017) found differences among verbs, but each verb was presented with a different object and result (e.g., closing a door, picking an apple), so these differences could not be separated from differences in the depicted action–result relations. Neither study varied how strongly the action is associated with the result while holding the object and the result constant. The present study does so by comparing V1s that act on the same object and share a target result but differ in their association with that result. If children’s judgments depend on this association, they should reject V1 descriptions of zero-result events more often for the stronger-association V1 than for its weaker-association partner.</w:t>
+        <w:t xml:space="preserve"> “several times,” and found that children, unlike adults, were not influenced by whether the agent was in control of the event. Chen (2017) found differences among verbs, but each verb was presented with a different object and result (e.g., closing a door, picking an apple), so these differences could not be separated from differences in the depicted action–result relations. Neither study varied how strongly the action is associated with the result while holding the object and the result constant. The present study does so by comparing V1s that name actions on the same object with the same target result but differ in their association with that result. If children’s judgments depend on this association, they should reject V1 descriptions of zero-result events more often for the stronger-association V1 than for its weaker-association partner.</w:t>
       </w:r>
     </w:p>
     <w:p>
@@ -1220,12 +1220,11 @@
       <w:pPr/>
       <w:r>
         <w:rPr/>
-        <w:t xml:space="preserve">The study comprises a comprehension experiment and an elicited-production experiment with independent samples of 4-year-olds, 5-year-olds, and adults. Both use the same 40 videos: 10 pairs of actions, each pair sharing an object and a target result, with each action filmed in a full-result and a zero-result version. Each pair was constructed so that one V1–object expression </w:t>
-      </w:r>
-      <w:r>
-        <w:rPr/>
-        <w:lastRenderedPageBreak/>
-        <w:t xml:space="preserve">was expected to be more strongly associated with the target result than the other (e.g., </w:t>
+        <w:t>The study comprises a comprehension experiment and an elicited-production experiment with independent samples of 4-year-olds, 5-year-olds, and adults. Both use the same 40 videos: 10 pairs of actions, each pair sharing an object and a target result, with each action filmed in a full-result and a zero-result version. Each pair was constructed so that one action was expected to be more strongly associated</w:t>
+      </w:r>
+      <w:r>
+        <w:rPr/>
+        <w:t xml:space="preserve"> with the target result than the other (e.g., </w:t>
       </w:r>
       <w:proofErr w:type="spellStart"/>
       <w:r>
@@ -4588,16 +4587,7 @@
         <w:t>⟦指导语、量表两端标签及一个题目的原文和译文待补⟧</w:t>
       </w:r>
       <w:r>
-        <w:t xml:space="preserve"> Because the ratings were collected for sentences naming the expressions, they characterize the action–result relation that each expression describes, not the particular videos. Four lists varied the order of presentation. </w:t>
-      </w:r>
-      <w:r>
-        <w:rPr>
-          <w:highlight w:val="yellow"/>
-        </w:rPr>
-        <w:t>⟦待核：norming 报告第 1 节说四个 list 改变了两个区块的顺序，第 7 节又说所有人先做可能性、再做典型性⟧</w:t>
-      </w:r>
-      <w:r>
-        <w:t xml:space="preserve"> All raters completed all items, and no ratings were excluded.</w:t>
+        <w:t xml:space="preserve"> Because the ratings were collected for sentences naming the expressions, they characterize the action–result relation that each expression describes, not the particular videos. The order of the two blocks was counterbalanced across four lists, which limits, but does not remove, carryover from one judgment to the other. All raters completed all items, and no ratings were excluded.</w:t>
       </w:r>
     </w:p>
     <w:p>

</xml_diff>

<commit_message>
R9: CCL counts as single values (estimates for sampled RVCs), clarify estimation in text and table note
Co-Authored-By: Claude Opus 5.5 <noreply@anthropic.com>
Claude-Session: https://claude.ai/code/session_01Q96WePso3R7jviE8KBARip
</commit_message>
<xml_diff>
--- a/drafts/Manuscript_R9_APA.docx
+++ b/drafts/Manuscript_R9_APA.docx
@@ -1592,6 +1592,7 @@
       <w:tr>
         <w:trPr>
           <w:tblHeader w:val="true"/>
+          <w:cantSplit/>
         </w:trPr>
         <w:tc>
           <w:tcPr>
@@ -1603,6 +1604,7 @@
           <w:p>
             <w:pPr>
               <w:pStyle w:val="TableText"/>
+              <w:keepNext/>
               <w:jc w:val="left"/>
             </w:pPr>
             <w:r/>
@@ -1621,6 +1623,7 @@
           <w:p>
             <w:pPr>
               <w:pStyle w:val="TableText"/>
+              <w:keepNext/>
               <w:jc w:val="left"/>
             </w:pPr>
             <w:r/>
@@ -1639,6 +1642,7 @@
           <w:p>
             <w:pPr>
               <w:pStyle w:val="TableText"/>
+              <w:keepNext/>
               <w:jc w:val="left"/>
             </w:pPr>
             <w:r/>
@@ -1657,6 +1661,7 @@
           <w:p>
             <w:pPr>
               <w:pStyle w:val="TableText"/>
+              <w:keepNext/>
               <w:jc w:val="left"/>
             </w:pPr>
             <w:r/>
@@ -1675,6 +1680,7 @@
           <w:p>
             <w:pPr>
               <w:pStyle w:val="TableText"/>
+              <w:keepNext/>
               <w:jc w:val="left"/>
             </w:pPr>
             <w:r/>
@@ -1693,6 +1699,7 @@
           <w:p>
             <w:pPr>
               <w:pStyle w:val="TableText"/>
+              <w:keepNext/>
               <w:jc w:val="center"/>
             </w:pPr>
             <w:r/>
@@ -1732,6 +1739,7 @@
           <w:p>
             <w:pPr>
               <w:pStyle w:val="TableText"/>
+              <w:keepNext/>
               <w:jc w:val="center"/>
             </w:pPr>
             <w:r/>
@@ -1771,6 +1779,7 @@
           <w:p>
             <w:pPr>
               <w:pStyle w:val="TableText"/>
+              <w:keepNext/>
               <w:jc w:val="center"/>
             </w:pPr>
             <w:r/>
@@ -1787,6 +1796,9 @@
         </w:tc>
       </w:tr>
       <w:tr>
+        <w:trPr>
+          <w:cantSplit/>
+        </w:trPr>
         <w:tc>
           <w:tcPr>
             <w:tcW w:type="dxa" w:w="504"/>
@@ -1795,6 +1807,7 @@
           <w:p>
             <w:pPr>
               <w:pStyle w:val="TableText"/>
+              <w:keepNext/>
               <w:jc w:val="left"/>
             </w:pPr>
             <w:r/>
@@ -1811,6 +1824,7 @@
           <w:p>
             <w:pPr>
               <w:pStyle w:val="TableText"/>
+              <w:keepNext/>
               <w:jc w:val="left"/>
             </w:pPr>
             <w:r/>
@@ -1836,6 +1850,7 @@
           <w:p>
             <w:pPr>
               <w:pStyle w:val="TableText"/>
+              <w:keepNext/>
               <w:jc w:val="left"/>
             </w:pPr>
             <w:r/>
@@ -1860,6 +1875,7 @@
           <w:p>
             <w:pPr>
               <w:pStyle w:val="TableText"/>
+              <w:keepNext/>
               <w:jc w:val="left"/>
             </w:pPr>
             <w:r/>
@@ -1884,6 +1900,7 @@
           <w:p>
             <w:pPr>
               <w:pStyle w:val="TableText"/>
+              <w:keepNext/>
               <w:jc w:val="left"/>
             </w:pPr>
             <w:r/>
@@ -1902,6 +1919,7 @@
           <w:p>
             <w:pPr>
               <w:pStyle w:val="TableText"/>
+              <w:keepNext/>
               <w:jc w:val="center"/>
             </w:pPr>
             <w:r/>
@@ -1917,6 +1935,7 @@
           <w:p>
             <w:pPr>
               <w:pStyle w:val="TableText"/>
+              <w:keepNext/>
               <w:jc w:val="center"/>
             </w:pPr>
             <w:r/>
@@ -1932,16 +1951,20 @@
           <w:p>
             <w:pPr>
               <w:pStyle w:val="TableText"/>
+              <w:keepNext/>
               <w:jc w:val="center"/>
             </w:pPr>
             <w:r/>
             <w:r>
-              <w:t>≈1,700</w:t>
+              <w:t>1,700</w:t>
             </w:r>
           </w:p>
         </w:tc>
       </w:tr>
       <w:tr>
+        <w:trPr>
+          <w:cantSplit/>
+        </w:trPr>
         <w:tc>
           <w:tcPr>
             <w:tcW w:type="dxa" w:w="504"/>
@@ -1970,6 +1993,7 @@
           <w:p>
             <w:pPr>
               <w:pStyle w:val="TableText"/>
+              <w:keepNext/>
               <w:jc w:val="left"/>
             </w:pPr>
             <w:r/>
@@ -1994,6 +2018,7 @@
           <w:p>
             <w:pPr>
               <w:pStyle w:val="TableText"/>
+              <w:keepNext/>
               <w:jc w:val="left"/>
             </w:pPr>
             <w:r/>
@@ -2012,6 +2037,7 @@
           <w:p>
             <w:pPr>
               <w:pStyle w:val="TableText"/>
+              <w:keepNext/>
               <w:jc w:val="center"/>
             </w:pPr>
             <w:r/>
@@ -2027,6 +2053,7 @@
           <w:p>
             <w:pPr>
               <w:pStyle w:val="TableText"/>
+              <w:keepNext/>
               <w:jc w:val="center"/>
             </w:pPr>
             <w:r/>
@@ -2042,16 +2069,20 @@
           <w:p>
             <w:pPr>
               <w:pStyle w:val="TableText"/>
+              <w:keepNext/>
               <w:jc w:val="center"/>
             </w:pPr>
             <w:r/>
             <w:r>
-              <w:t>≈28</w:t>
+              <w:t>28</w:t>
             </w:r>
           </w:p>
         </w:tc>
       </w:tr>
       <w:tr>
+        <w:trPr>
+          <w:cantSplit/>
+        </w:trPr>
         <w:tc>
           <w:tcPr>
             <w:tcW w:type="dxa" w:w="504"/>
@@ -2060,6 +2091,7 @@
           <w:p>
             <w:pPr>
               <w:pStyle w:val="TableText"/>
+              <w:keepNext/>
               <w:jc w:val="left"/>
             </w:pPr>
             <w:r/>
@@ -2076,6 +2108,7 @@
           <w:p>
             <w:pPr>
               <w:pStyle w:val="TableText"/>
+              <w:keepNext/>
               <w:jc w:val="left"/>
             </w:pPr>
             <w:r/>
@@ -2101,6 +2134,7 @@
           <w:p>
             <w:pPr>
               <w:pStyle w:val="TableText"/>
+              <w:keepNext/>
               <w:jc w:val="left"/>
             </w:pPr>
             <w:r/>
@@ -2125,6 +2159,7 @@
           <w:p>
             <w:pPr>
               <w:pStyle w:val="TableText"/>
+              <w:keepNext/>
               <w:jc w:val="left"/>
             </w:pPr>
             <w:r/>
@@ -2149,6 +2184,7 @@
           <w:p>
             <w:pPr>
               <w:pStyle w:val="TableText"/>
+              <w:keepNext/>
               <w:jc w:val="left"/>
             </w:pPr>
             <w:r/>
@@ -2167,6 +2203,7 @@
           <w:p>
             <w:pPr>
               <w:pStyle w:val="TableText"/>
+              <w:keepNext/>
               <w:jc w:val="center"/>
             </w:pPr>
             <w:r/>
@@ -2182,6 +2219,7 @@
           <w:p>
             <w:pPr>
               <w:pStyle w:val="TableText"/>
+              <w:keepNext/>
               <w:jc w:val="center"/>
             </w:pPr>
             <w:r/>
@@ -2197,16 +2235,20 @@
           <w:p>
             <w:pPr>
               <w:pStyle w:val="TableText"/>
+              <w:keepNext/>
               <w:jc w:val="center"/>
             </w:pPr>
             <w:r/>
             <w:r>
-              <w:t>≈1,780</w:t>
+              <w:t>1,780</w:t>
             </w:r>
           </w:p>
         </w:tc>
       </w:tr>
       <w:tr>
+        <w:trPr>
+          <w:cantSplit/>
+        </w:trPr>
         <w:tc>
           <w:tcPr>
             <w:tcW w:type="dxa" w:w="504"/>
@@ -2235,6 +2277,7 @@
           <w:p>
             <w:pPr>
               <w:pStyle w:val="TableText"/>
+              <w:keepNext/>
               <w:jc w:val="left"/>
             </w:pPr>
             <w:r/>
@@ -2259,6 +2302,7 @@
           <w:p>
             <w:pPr>
               <w:pStyle w:val="TableText"/>
+              <w:keepNext/>
               <w:jc w:val="left"/>
             </w:pPr>
             <w:r/>
@@ -2277,6 +2321,7 @@
           <w:p>
             <w:pPr>
               <w:pStyle w:val="TableText"/>
+              <w:keepNext/>
               <w:jc w:val="center"/>
             </w:pPr>
             <w:r/>
@@ -2292,6 +2337,7 @@
           <w:p>
             <w:pPr>
               <w:pStyle w:val="TableText"/>
+              <w:keepNext/>
               <w:jc w:val="center"/>
             </w:pPr>
             <w:r/>
@@ -2307,16 +2353,20 @@
           <w:p>
             <w:pPr>
               <w:pStyle w:val="TableText"/>
+              <w:keepNext/>
               <w:jc w:val="center"/>
             </w:pPr>
             <w:r/>
             <w:r>
-              <w:t>11–14</w:t>
+              <w:t>13ᵈ</w:t>
             </w:r>
           </w:p>
         </w:tc>
       </w:tr>
       <w:tr>
+        <w:trPr>
+          <w:cantSplit/>
+        </w:trPr>
         <w:tc>
           <w:tcPr>
             <w:tcW w:type="dxa" w:w="504"/>
@@ -2325,6 +2375,7 @@
           <w:p>
             <w:pPr>
               <w:pStyle w:val="TableText"/>
+              <w:keepNext/>
               <w:jc w:val="left"/>
             </w:pPr>
             <w:r/>
@@ -2341,6 +2392,7 @@
           <w:p>
             <w:pPr>
               <w:pStyle w:val="TableText"/>
+              <w:keepNext/>
               <w:jc w:val="left"/>
             </w:pPr>
             <w:r/>
@@ -2366,6 +2418,7 @@
           <w:p>
             <w:pPr>
               <w:pStyle w:val="TableText"/>
+              <w:keepNext/>
               <w:jc w:val="left"/>
             </w:pPr>
             <w:r/>
@@ -2390,6 +2443,7 @@
           <w:p>
             <w:pPr>
               <w:pStyle w:val="TableText"/>
+              <w:keepNext/>
               <w:jc w:val="left"/>
             </w:pPr>
             <w:r/>
@@ -2414,6 +2468,7 @@
           <w:p>
             <w:pPr>
               <w:pStyle w:val="TableText"/>
+              <w:keepNext/>
               <w:jc w:val="left"/>
             </w:pPr>
             <w:r/>
@@ -2432,6 +2487,7 @@
           <w:p>
             <w:pPr>
               <w:pStyle w:val="TableText"/>
+              <w:keepNext/>
               <w:jc w:val="center"/>
             </w:pPr>
             <w:r/>
@@ -2447,6 +2503,7 @@
           <w:p>
             <w:pPr>
               <w:pStyle w:val="TableText"/>
+              <w:keepNext/>
               <w:jc w:val="center"/>
             </w:pPr>
             <w:r/>
@@ -2462,16 +2519,20 @@
           <w:p>
             <w:pPr>
               <w:pStyle w:val="TableText"/>
+              <w:keepNext/>
               <w:jc w:val="center"/>
             </w:pPr>
             <w:r/>
             <w:r>
-              <w:t>≈134ᵇ</w:t>
+              <w:t>130ᵇ</w:t>
             </w:r>
           </w:p>
         </w:tc>
       </w:tr>
       <w:tr>
+        <w:trPr>
+          <w:cantSplit/>
+        </w:trPr>
         <w:tc>
           <w:tcPr>
             <w:tcW w:type="dxa" w:w="504"/>
@@ -2500,6 +2561,7 @@
           <w:p>
             <w:pPr>
               <w:pStyle w:val="TableText"/>
+              <w:keepNext/>
               <w:jc w:val="left"/>
             </w:pPr>
             <w:r/>
@@ -2524,6 +2586,7 @@
           <w:p>
             <w:pPr>
               <w:pStyle w:val="TableText"/>
+              <w:keepNext/>
               <w:jc w:val="left"/>
             </w:pPr>
             <w:r/>
@@ -2542,6 +2605,7 @@
           <w:p>
             <w:pPr>
               <w:pStyle w:val="TableText"/>
+              <w:keepNext/>
               <w:jc w:val="center"/>
             </w:pPr>
             <w:r/>
@@ -2557,6 +2621,7 @@
           <w:p>
             <w:pPr>
               <w:pStyle w:val="TableText"/>
+              <w:keepNext/>
               <w:jc w:val="center"/>
             </w:pPr>
             <w:r/>
@@ -2572,6 +2637,7 @@
           <w:p>
             <w:pPr>
               <w:pStyle w:val="TableText"/>
+              <w:keepNext/>
               <w:jc w:val="center"/>
             </w:pPr>
             <w:r/>
@@ -2582,6 +2648,9 @@
         </w:tc>
       </w:tr>
       <w:tr>
+        <w:trPr>
+          <w:cantSplit/>
+        </w:trPr>
         <w:tc>
           <w:tcPr>
             <w:tcW w:type="dxa" w:w="504"/>
@@ -2590,6 +2659,7 @@
           <w:p>
             <w:pPr>
               <w:pStyle w:val="TableText"/>
+              <w:keepNext/>
               <w:jc w:val="left"/>
             </w:pPr>
             <w:r/>
@@ -2606,6 +2676,7 @@
           <w:p>
             <w:pPr>
               <w:pStyle w:val="TableText"/>
+              <w:keepNext/>
               <w:jc w:val="left"/>
             </w:pPr>
             <w:r/>
@@ -2631,6 +2702,7 @@
           <w:p>
             <w:pPr>
               <w:pStyle w:val="TableText"/>
+              <w:keepNext/>
               <w:jc w:val="left"/>
             </w:pPr>
             <w:r/>
@@ -2655,6 +2727,7 @@
           <w:p>
             <w:pPr>
               <w:pStyle w:val="TableText"/>
+              <w:keepNext/>
               <w:jc w:val="left"/>
             </w:pPr>
             <w:r/>
@@ -2679,6 +2752,7 @@
           <w:p>
             <w:pPr>
               <w:pStyle w:val="TableText"/>
+              <w:keepNext/>
               <w:jc w:val="left"/>
             </w:pPr>
             <w:r/>
@@ -2697,6 +2771,7 @@
           <w:p>
             <w:pPr>
               <w:pStyle w:val="TableText"/>
+              <w:keepNext/>
               <w:jc w:val="center"/>
             </w:pPr>
             <w:r/>
@@ -2712,6 +2787,7 @@
           <w:p>
             <w:pPr>
               <w:pStyle w:val="TableText"/>
+              <w:keepNext/>
               <w:jc w:val="center"/>
             </w:pPr>
             <w:r/>
@@ -2727,16 +2803,20 @@
           <w:p>
             <w:pPr>
               <w:pStyle w:val="TableText"/>
+              <w:keepNext/>
               <w:jc w:val="center"/>
             </w:pPr>
             <w:r/>
             <w:r>
-              <w:t>≈2,300–2,400</w:t>
+              <w:t>2,350</w:t>
             </w:r>
           </w:p>
         </w:tc>
       </w:tr>
       <w:tr>
+        <w:trPr>
+          <w:cantSplit/>
+        </w:trPr>
         <w:tc>
           <w:tcPr>
             <w:tcW w:type="dxa" w:w="504"/>
@@ -2765,6 +2845,7 @@
           <w:p>
             <w:pPr>
               <w:pStyle w:val="TableText"/>
+              <w:keepNext/>
               <w:jc w:val="left"/>
             </w:pPr>
             <w:r/>
@@ -2789,6 +2870,7 @@
           <w:p>
             <w:pPr>
               <w:pStyle w:val="TableText"/>
+              <w:keepNext/>
               <w:jc w:val="left"/>
             </w:pPr>
             <w:r/>
@@ -2807,6 +2889,7 @@
           <w:p>
             <w:pPr>
               <w:pStyle w:val="TableText"/>
+              <w:keepNext/>
               <w:jc w:val="center"/>
             </w:pPr>
             <w:r/>
@@ -2822,6 +2905,7 @@
           <w:p>
             <w:pPr>
               <w:pStyle w:val="TableText"/>
+              <w:keepNext/>
               <w:jc w:val="center"/>
             </w:pPr>
             <w:r/>
@@ -2837,6 +2921,7 @@
           <w:p>
             <w:pPr>
               <w:pStyle w:val="TableText"/>
+              <w:keepNext/>
               <w:jc w:val="center"/>
             </w:pPr>
             <w:r/>
@@ -2847,6 +2932,9 @@
         </w:tc>
       </w:tr>
       <w:tr>
+        <w:trPr>
+          <w:cantSplit/>
+        </w:trPr>
         <w:tc>
           <w:tcPr>
             <w:tcW w:type="dxa" w:w="504"/>
@@ -2855,6 +2943,7 @@
           <w:p>
             <w:pPr>
               <w:pStyle w:val="TableText"/>
+              <w:keepNext/>
               <w:jc w:val="left"/>
             </w:pPr>
             <w:r/>
@@ -2871,6 +2960,7 @@
           <w:p>
             <w:pPr>
               <w:pStyle w:val="TableText"/>
+              <w:keepNext/>
               <w:jc w:val="left"/>
             </w:pPr>
             <w:r/>
@@ -2896,6 +2986,7 @@
           <w:p>
             <w:pPr>
               <w:pStyle w:val="TableText"/>
+              <w:keepNext/>
               <w:jc w:val="left"/>
             </w:pPr>
             <w:r/>
@@ -2920,6 +3011,7 @@
           <w:p>
             <w:pPr>
               <w:pStyle w:val="TableText"/>
+              <w:keepNext/>
               <w:jc w:val="left"/>
             </w:pPr>
             <w:r/>
@@ -2944,6 +3036,7 @@
           <w:p>
             <w:pPr>
               <w:pStyle w:val="TableText"/>
+              <w:keepNext/>
               <w:jc w:val="left"/>
             </w:pPr>
             <w:r/>
@@ -2962,6 +3055,7 @@
           <w:p>
             <w:pPr>
               <w:pStyle w:val="TableText"/>
+              <w:keepNext/>
               <w:jc w:val="center"/>
             </w:pPr>
             <w:r/>
@@ -2977,6 +3071,7 @@
           <w:p>
             <w:pPr>
               <w:pStyle w:val="TableText"/>
+              <w:keepNext/>
               <w:jc w:val="center"/>
             </w:pPr>
             <w:r/>
@@ -2992,16 +3087,20 @@
           <w:p>
             <w:pPr>
               <w:pStyle w:val="TableText"/>
+              <w:keepNext/>
               <w:jc w:val="center"/>
             </w:pPr>
             <w:r/>
             <w:r>
-              <w:t>≈768</w:t>
+              <w:t>770</w:t>
             </w:r>
           </w:p>
         </w:tc>
       </w:tr>
       <w:tr>
+        <w:trPr>
+          <w:cantSplit/>
+        </w:trPr>
         <w:tc>
           <w:tcPr>
             <w:tcW w:type="dxa" w:w="504"/>
@@ -3030,6 +3129,7 @@
           <w:p>
             <w:pPr>
               <w:pStyle w:val="TableText"/>
+              <w:keepNext/>
               <w:jc w:val="left"/>
             </w:pPr>
             <w:r/>
@@ -3054,6 +3154,7 @@
           <w:p>
             <w:pPr>
               <w:pStyle w:val="TableText"/>
+              <w:keepNext/>
               <w:jc w:val="left"/>
             </w:pPr>
             <w:r/>
@@ -3072,6 +3173,7 @@
           <w:p>
             <w:pPr>
               <w:pStyle w:val="TableText"/>
+              <w:keepNext/>
               <w:jc w:val="center"/>
             </w:pPr>
             <w:r/>
@@ -3087,6 +3189,7 @@
           <w:p>
             <w:pPr>
               <w:pStyle w:val="TableText"/>
+              <w:keepNext/>
               <w:jc w:val="center"/>
             </w:pPr>
             <w:r/>
@@ -3102,6 +3205,7 @@
           <w:p>
             <w:pPr>
               <w:pStyle w:val="TableText"/>
+              <w:keepNext/>
               <w:jc w:val="center"/>
             </w:pPr>
             <w:r/>
@@ -3112,6 +3216,9 @@
         </w:tc>
       </w:tr>
       <w:tr>
+        <w:trPr>
+          <w:cantSplit/>
+        </w:trPr>
         <w:tc>
           <w:tcPr>
             <w:tcW w:type="dxa" w:w="504"/>
@@ -3120,6 +3227,7 @@
           <w:p>
             <w:pPr>
               <w:pStyle w:val="TableText"/>
+              <w:keepNext/>
               <w:jc w:val="left"/>
             </w:pPr>
             <w:r/>
@@ -3136,6 +3244,7 @@
           <w:p>
             <w:pPr>
               <w:pStyle w:val="TableText"/>
+              <w:keepNext/>
               <w:jc w:val="left"/>
             </w:pPr>
             <w:r/>
@@ -3161,6 +3270,7 @@
           <w:p>
             <w:pPr>
               <w:pStyle w:val="TableText"/>
+              <w:keepNext/>
               <w:jc w:val="left"/>
             </w:pPr>
             <w:r/>
@@ -3185,6 +3295,7 @@
           <w:p>
             <w:pPr>
               <w:pStyle w:val="TableText"/>
+              <w:keepNext/>
               <w:jc w:val="left"/>
             </w:pPr>
             <w:r/>
@@ -3209,6 +3320,7 @@
           <w:p>
             <w:pPr>
               <w:pStyle w:val="TableText"/>
+              <w:keepNext/>
               <w:jc w:val="left"/>
             </w:pPr>
             <w:r/>
@@ -3227,6 +3339,7 @@
           <w:p>
             <w:pPr>
               <w:pStyle w:val="TableText"/>
+              <w:keepNext/>
               <w:jc w:val="center"/>
             </w:pPr>
             <w:r/>
@@ -3242,6 +3355,7 @@
           <w:p>
             <w:pPr>
               <w:pStyle w:val="TableText"/>
+              <w:keepNext/>
               <w:jc w:val="center"/>
             </w:pPr>
             <w:r/>
@@ -3257,16 +3371,20 @@
           <w:p>
             <w:pPr>
               <w:pStyle w:val="TableText"/>
+              <w:keepNext/>
               <w:jc w:val="center"/>
             </w:pPr>
             <w:r/>
             <w:r>
-              <w:t>≈480</w:t>
+              <w:t>480</w:t>
             </w:r>
           </w:p>
         </w:tc>
       </w:tr>
       <w:tr>
+        <w:trPr>
+          <w:cantSplit/>
+        </w:trPr>
         <w:tc>
           <w:tcPr>
             <w:tcW w:type="dxa" w:w="504"/>
@@ -3295,6 +3413,7 @@
           <w:p>
             <w:pPr>
               <w:pStyle w:val="TableText"/>
+              <w:keepNext/>
               <w:jc w:val="left"/>
             </w:pPr>
             <w:r/>
@@ -3319,6 +3438,7 @@
           <w:p>
             <w:pPr>
               <w:pStyle w:val="TableText"/>
+              <w:keepNext/>
               <w:jc w:val="left"/>
             </w:pPr>
             <w:r/>
@@ -3337,6 +3457,7 @@
           <w:p>
             <w:pPr>
               <w:pStyle w:val="TableText"/>
+              <w:keepNext/>
               <w:jc w:val="center"/>
             </w:pPr>
             <w:r/>
@@ -3352,6 +3473,7 @@
           <w:p>
             <w:pPr>
               <w:pStyle w:val="TableText"/>
+              <w:keepNext/>
               <w:jc w:val="center"/>
             </w:pPr>
             <w:r/>
@@ -3367,16 +3489,20 @@
           <w:p>
             <w:pPr>
               <w:pStyle w:val="TableText"/>
+              <w:keepNext/>
               <w:jc w:val="center"/>
             </w:pPr>
             <w:r/>
             <w:r>
-              <w:t>≈5,750ᶜ</w:t>
+              <w:t>5,750ᶜ</w:t>
             </w:r>
           </w:p>
         </w:tc>
       </w:tr>
       <w:tr>
+        <w:trPr>
+          <w:cantSplit/>
+        </w:trPr>
         <w:tc>
           <w:tcPr>
             <w:tcW w:type="dxa" w:w="504"/>
@@ -3385,6 +3511,7 @@
           <w:p>
             <w:pPr>
               <w:pStyle w:val="TableText"/>
+              <w:keepNext/>
               <w:jc w:val="left"/>
             </w:pPr>
             <w:r/>
@@ -3401,6 +3528,7 @@
           <w:p>
             <w:pPr>
               <w:pStyle w:val="TableText"/>
+              <w:keepNext/>
               <w:jc w:val="left"/>
             </w:pPr>
             <w:r/>
@@ -3426,6 +3554,7 @@
           <w:p>
             <w:pPr>
               <w:pStyle w:val="TableText"/>
+              <w:keepNext/>
               <w:jc w:val="left"/>
             </w:pPr>
             <w:r/>
@@ -3450,6 +3579,7 @@
           <w:p>
             <w:pPr>
               <w:pStyle w:val="TableText"/>
+              <w:keepNext/>
               <w:jc w:val="left"/>
             </w:pPr>
             <w:r/>
@@ -3474,6 +3604,7 @@
           <w:p>
             <w:pPr>
               <w:pStyle w:val="TableText"/>
+              <w:keepNext/>
               <w:jc w:val="left"/>
             </w:pPr>
             <w:r/>
@@ -3492,6 +3623,7 @@
           <w:p>
             <w:pPr>
               <w:pStyle w:val="TableText"/>
+              <w:keepNext/>
               <w:jc w:val="center"/>
             </w:pPr>
             <w:r/>
@@ -3507,6 +3639,7 @@
           <w:p>
             <w:pPr>
               <w:pStyle w:val="TableText"/>
+              <w:keepNext/>
               <w:jc w:val="center"/>
             </w:pPr>
             <w:r/>
@@ -3522,6 +3655,7 @@
           <w:p>
             <w:pPr>
               <w:pStyle w:val="TableText"/>
+              <w:keepNext/>
               <w:jc w:val="center"/>
             </w:pPr>
             <w:r/>
@@ -3532,6 +3666,9 @@
         </w:tc>
       </w:tr>
       <w:tr>
+        <w:trPr>
+          <w:cantSplit/>
+        </w:trPr>
         <w:tc>
           <w:tcPr>
             <w:tcW w:type="dxa" w:w="504"/>
@@ -3560,6 +3697,7 @@
           <w:p>
             <w:pPr>
               <w:pStyle w:val="TableText"/>
+              <w:keepNext/>
               <w:jc w:val="left"/>
             </w:pPr>
             <w:r/>
@@ -3584,6 +3722,7 @@
           <w:p>
             <w:pPr>
               <w:pStyle w:val="TableText"/>
+              <w:keepNext/>
               <w:jc w:val="left"/>
             </w:pPr>
             <w:r/>
@@ -3602,6 +3741,7 @@
           <w:p>
             <w:pPr>
               <w:pStyle w:val="TableText"/>
+              <w:keepNext/>
               <w:jc w:val="center"/>
             </w:pPr>
             <w:r/>
@@ -3617,6 +3757,7 @@
           <w:p>
             <w:pPr>
               <w:pStyle w:val="TableText"/>
+              <w:keepNext/>
               <w:jc w:val="center"/>
             </w:pPr>
             <w:r/>
@@ -3632,16 +3773,20 @@
           <w:p>
             <w:pPr>
               <w:pStyle w:val="TableText"/>
+              <w:keepNext/>
               <w:jc w:val="center"/>
             </w:pPr>
             <w:r/>
             <w:r>
-              <w:t>≈4,500</w:t>
+              <w:t>4,560</w:t>
             </w:r>
           </w:p>
         </w:tc>
       </w:tr>
       <w:tr>
+        <w:trPr>
+          <w:cantSplit/>
+        </w:trPr>
         <w:tc>
           <w:tcPr>
             <w:tcW w:type="dxa" w:w="504"/>
@@ -3650,6 +3795,7 @@
           <w:p>
             <w:pPr>
               <w:pStyle w:val="TableText"/>
+              <w:keepNext/>
               <w:jc w:val="left"/>
             </w:pPr>
             <w:r/>
@@ -3666,6 +3812,7 @@
           <w:p>
             <w:pPr>
               <w:pStyle w:val="TableText"/>
+              <w:keepNext/>
               <w:jc w:val="left"/>
             </w:pPr>
             <w:r/>
@@ -3691,6 +3838,7 @@
           <w:p>
             <w:pPr>
               <w:pStyle w:val="TableText"/>
+              <w:keepNext/>
               <w:jc w:val="left"/>
             </w:pPr>
             <w:r/>
@@ -3715,6 +3863,7 @@
           <w:p>
             <w:pPr>
               <w:pStyle w:val="TableText"/>
+              <w:keepNext/>
               <w:jc w:val="left"/>
             </w:pPr>
             <w:r/>
@@ -3739,6 +3888,7 @@
           <w:p>
             <w:pPr>
               <w:pStyle w:val="TableText"/>
+              <w:keepNext/>
               <w:jc w:val="left"/>
             </w:pPr>
             <w:r/>
@@ -3757,6 +3907,7 @@
           <w:p>
             <w:pPr>
               <w:pStyle w:val="TableText"/>
+              <w:keepNext/>
               <w:jc w:val="center"/>
             </w:pPr>
             <w:r/>
@@ -3772,6 +3923,7 @@
           <w:p>
             <w:pPr>
               <w:pStyle w:val="TableText"/>
+              <w:keepNext/>
               <w:jc w:val="center"/>
             </w:pPr>
             <w:r/>
@@ -3787,16 +3939,20 @@
           <w:p>
             <w:pPr>
               <w:pStyle w:val="TableText"/>
+              <w:keepNext/>
               <w:jc w:val="center"/>
             </w:pPr>
             <w:r/>
             <w:r>
-              <w:t>≈90–125</w:t>
+              <w:t>110</w:t>
             </w:r>
           </w:p>
         </w:tc>
       </w:tr>
       <w:tr>
+        <w:trPr>
+          <w:cantSplit/>
+        </w:trPr>
         <w:tc>
           <w:tcPr>
             <w:tcW w:type="dxa" w:w="504"/>
@@ -3825,6 +3981,7 @@
           <w:p>
             <w:pPr>
               <w:pStyle w:val="TableText"/>
+              <w:keepNext/>
               <w:jc w:val="left"/>
             </w:pPr>
             <w:r/>
@@ -3849,6 +4006,7 @@
           <w:p>
             <w:pPr>
               <w:pStyle w:val="TableText"/>
+              <w:keepNext/>
               <w:jc w:val="left"/>
             </w:pPr>
             <w:r/>
@@ -3867,6 +4025,7 @@
           <w:p>
             <w:pPr>
               <w:pStyle w:val="TableText"/>
+              <w:keepNext/>
               <w:jc w:val="center"/>
             </w:pPr>
             <w:r/>
@@ -3882,6 +4041,7 @@
           <w:p>
             <w:pPr>
               <w:pStyle w:val="TableText"/>
+              <w:keepNext/>
               <w:jc w:val="center"/>
             </w:pPr>
             <w:r/>
@@ -3897,6 +4057,7 @@
           <w:p>
             <w:pPr>
               <w:pStyle w:val="TableText"/>
+              <w:keepNext/>
               <w:jc w:val="center"/>
             </w:pPr>
             <w:r/>
@@ -3907,6 +4068,9 @@
         </w:tc>
       </w:tr>
       <w:tr>
+        <w:trPr>
+          <w:cantSplit/>
+        </w:trPr>
         <w:tc>
           <w:tcPr>
             <w:tcW w:type="dxa" w:w="504"/>
@@ -3915,6 +4079,7 @@
           <w:p>
             <w:pPr>
               <w:pStyle w:val="TableText"/>
+              <w:keepNext/>
               <w:jc w:val="left"/>
             </w:pPr>
             <w:r/>
@@ -3931,6 +4096,7 @@
           <w:p>
             <w:pPr>
               <w:pStyle w:val="TableText"/>
+              <w:keepNext/>
               <w:jc w:val="left"/>
             </w:pPr>
             <w:r/>
@@ -3956,6 +4122,7 @@
           <w:p>
             <w:pPr>
               <w:pStyle w:val="TableText"/>
+              <w:keepNext/>
               <w:jc w:val="left"/>
             </w:pPr>
             <w:r/>
@@ -3980,6 +4147,7 @@
           <w:p>
             <w:pPr>
               <w:pStyle w:val="TableText"/>
+              <w:keepNext/>
               <w:jc w:val="left"/>
             </w:pPr>
             <w:r/>
@@ -4004,6 +4172,7 @@
           <w:p>
             <w:pPr>
               <w:pStyle w:val="TableText"/>
+              <w:keepNext/>
               <w:jc w:val="left"/>
             </w:pPr>
             <w:r/>
@@ -4022,6 +4191,7 @@
           <w:p>
             <w:pPr>
               <w:pStyle w:val="TableText"/>
+              <w:keepNext/>
               <w:jc w:val="center"/>
             </w:pPr>
             <w:r/>
@@ -4037,6 +4207,7 @@
           <w:p>
             <w:pPr>
               <w:pStyle w:val="TableText"/>
+              <w:keepNext/>
               <w:jc w:val="center"/>
             </w:pPr>
             <w:r/>
@@ -4052,16 +4223,20 @@
           <w:p>
             <w:pPr>
               <w:pStyle w:val="TableText"/>
+              <w:keepNext/>
               <w:jc w:val="center"/>
             </w:pPr>
             <w:r/>
             <w:r>
-              <w:t>≈1,800–1,890</w:t>
+              <w:t>1,840</w:t>
             </w:r>
           </w:p>
         </w:tc>
       </w:tr>
       <w:tr>
+        <w:trPr>
+          <w:cantSplit/>
+        </w:trPr>
         <w:tc>
           <w:tcPr>
             <w:tcW w:type="dxa" w:w="504"/>
@@ -4090,6 +4265,7 @@
           <w:p>
             <w:pPr>
               <w:pStyle w:val="TableText"/>
+              <w:keepNext/>
               <w:jc w:val="left"/>
             </w:pPr>
             <w:r/>
@@ -4114,6 +4290,7 @@
           <w:p>
             <w:pPr>
               <w:pStyle w:val="TableText"/>
+              <w:keepNext/>
               <w:jc w:val="left"/>
             </w:pPr>
             <w:r/>
@@ -4132,6 +4309,7 @@
           <w:p>
             <w:pPr>
               <w:pStyle w:val="TableText"/>
+              <w:keepNext/>
               <w:jc w:val="center"/>
             </w:pPr>
             <w:r/>
@@ -4147,6 +4325,7 @@
           <w:p>
             <w:pPr>
               <w:pStyle w:val="TableText"/>
+              <w:keepNext/>
               <w:jc w:val="center"/>
             </w:pPr>
             <w:r/>
@@ -4162,16 +4341,20 @@
           <w:p>
             <w:pPr>
               <w:pStyle w:val="TableText"/>
+              <w:keepNext/>
               <w:jc w:val="center"/>
             </w:pPr>
             <w:r/>
             <w:r>
-              <w:t>≈300–316</w:t>
+              <w:t>310</w:t>
             </w:r>
           </w:p>
         </w:tc>
       </w:tr>
       <w:tr>
+        <w:trPr>
+          <w:cantSplit/>
+        </w:trPr>
         <w:tc>
           <w:tcPr>
             <w:tcW w:type="dxa" w:w="504"/>
@@ -4180,6 +4363,7 @@
           <w:p>
             <w:pPr>
               <w:pStyle w:val="TableText"/>
+              <w:keepNext/>
               <w:jc w:val="left"/>
             </w:pPr>
             <w:r/>
@@ -4196,6 +4380,7 @@
           <w:p>
             <w:pPr>
               <w:pStyle w:val="TableText"/>
+              <w:keepNext/>
               <w:jc w:val="left"/>
             </w:pPr>
             <w:r/>
@@ -4221,6 +4406,7 @@
           <w:p>
             <w:pPr>
               <w:pStyle w:val="TableText"/>
+              <w:keepNext/>
               <w:jc w:val="left"/>
             </w:pPr>
             <w:r/>
@@ -4245,6 +4431,7 @@
           <w:p>
             <w:pPr>
               <w:pStyle w:val="TableText"/>
+              <w:keepNext/>
               <w:jc w:val="left"/>
             </w:pPr>
             <w:r/>
@@ -4269,6 +4456,7 @@
           <w:p>
             <w:pPr>
               <w:pStyle w:val="TableText"/>
+              <w:keepNext/>
               <w:jc w:val="left"/>
             </w:pPr>
             <w:r/>
@@ -4287,6 +4475,7 @@
           <w:p>
             <w:pPr>
               <w:pStyle w:val="TableText"/>
+              <w:keepNext/>
               <w:jc w:val="center"/>
             </w:pPr>
             <w:r/>
@@ -4302,6 +4491,7 @@
           <w:p>
             <w:pPr>
               <w:pStyle w:val="TableText"/>
+              <w:keepNext/>
               <w:jc w:val="center"/>
             </w:pPr>
             <w:r/>
@@ -4317,16 +4507,20 @@
           <w:p>
             <w:pPr>
               <w:pStyle w:val="TableText"/>
+              <w:keepNext/>
               <w:jc w:val="center"/>
             </w:pPr>
             <w:r/>
             <w:r>
-              <w:t>≈48</w:t>
+              <w:t>48</w:t>
             </w:r>
           </w:p>
         </w:tc>
       </w:tr>
       <w:tr>
+        <w:trPr>
+          <w:cantSplit/>
+        </w:trPr>
         <w:tc>
           <w:tcPr>
             <w:tcW w:type="dxa" w:w="504"/>
@@ -4431,7 +4625,7 @@
             </w:pPr>
             <w:r/>
             <w:r>
-              <w:t>≈13</w:t>
+              <w:t>13</w:t>
             </w:r>
           </w:p>
         </w:tc>
@@ -4457,7 +4651,7 @@
         <w:t>n</w:t>
       </w:r>
       <w:r>
-        <w:t xml:space="preserve"> = 20 raters). In each pair, the first row is the expected stronger-association expression. CCL documents are estimated numbers of documents in the CCL corpus containing the RVC in its resultative use, after manual checking of the matches (see text). ᵃ Excluded from the analyses of Experiment 1 (see Pair Selection); set labels follow the original design. ᵇ Mostly figurative uses. ᶜ Includes many abstract uses.</w:t>
+        <w:t xml:space="preserve"> = 20 raters). In each pair, the first row is the expected stronger-association expression. CCL documents are numbers of documents in the CCL corpus containing the RVC in its resultative use. Counts of 100 or more are estimates (raw document count × proportion of resultative uses in a checked sample), rounded to the nearest 10; counts below 100 are based on checking all matches (see text). ᵃ Excluded from the analyses of Experiment 1 (see Pair Selection); set labels follow the original design. ᵇ Mostly figurative uses. ᶜ Includes many abstract uses. ᵈ Midpoint of 11–14; some matches could not be classified with certainty.</w:t>
       </w:r>
     </w:p>
     <w:p>
@@ -4777,7 +4971,7 @@
         <w:t>sī-pò liǎn</w:t>
       </w:r>
       <w:r>
-        <w:t xml:space="preserve"> “tear-torn face,” “fall out with someone”) were counted, because they also indicate that the combination is conventional. Estimated document counts are shown in Table 1.</w:t>
+        <w:t xml:space="preserve"> “tear-torn face,” “fall out with someone”) were counted, because they also indicate that the combination is conventional. For the RVCs checked by sampling, the number of documents was estimated by multiplying the raw document count by the proportion of checked matches that were resultative uses; for the other RVCs, all matches were checked. Document counts are shown in Table 1.</w:t>
       </w:r>
     </w:p>
     <w:p>
@@ -4792,7 +4986,7 @@
         <w:t>tuī-dǎo</w:t>
       </w:r>
       <w:r>
-        <w:t xml:space="preserve"> “push-fallen” (about 5,750 documents) was far more frequent than </w:t>
+        <w:t xml:space="preserve"> “push-fallen” (5,750 documents) was far more frequent than </w:t>
       </w:r>
       <w:r>
         <w:rPr>
@@ -4801,7 +4995,7 @@
         <w:t>tī-dǎo</w:t>
       </w:r>
       <w:r>
-        <w:t xml:space="preserve"> “kick-fallen” (about 480), largely because of abstract uses such as </w:t>
+        <w:t xml:space="preserve"> “kick-fallen” (480), largely because of abstract uses such as </w:t>
       </w:r>
       <w:r>
         <w:rPr>

</xml_diff>